<commit_message>
Entra-Anleitung korrigiert: tatsächliche Menüwege und Klickschritte
Co-Authored-By: Claude Opus 4.8 <noreply@anthropic.com>
</commit_message>
<xml_diff>
--- a/vorlagen/vorlage_angebot.docx
+++ b/vorlagen/vorlage_angebot.docx
@@ -402,7 +402,16 @@
           <w:szCs w:val="20"/>
           <w:lang w:val="de-DE"/>
         </w:rPr>
-        <w:t>Sehr geehrte(r) {{</w:t>
+        <w:t>Hallo</w:t>
+      </w:r>
+      <w:r>
+        <w:rPr>
+          <w:color w:val="auto"/>
+          <w:sz w:val="20"/>
+          <w:szCs w:val="20"/>
+          <w:lang w:val="de-DE"/>
+        </w:rPr>
+        <w:t xml:space="preserve"> {{</w:t>
       </w:r>
       <w:proofErr w:type="spellStart"/>
       <w:r>
@@ -515,7 +524,7 @@
         <w:tc>
           <w:tcPr>
             <w:tcW w:w="817" w:type="dxa"/>
-            <w:shd w:val="clear" w:color="auto" w:fill="6C5CE7"/>
+            <w:shd w:val="clear" w:color="auto" w:fill="0070C0"/>
           </w:tcPr>
           <w:p>
             <w:r>
@@ -531,7 +540,7 @@
         <w:tc>
           <w:tcPr>
             <w:tcW w:w="5633" w:type="dxa"/>
-            <w:shd w:val="clear" w:color="auto" w:fill="6C5CE7"/>
+            <w:shd w:val="clear" w:color="auto" w:fill="0070C0"/>
           </w:tcPr>
           <w:p>
             <w:proofErr w:type="spellStart"/>
@@ -549,7 +558,7 @@
         <w:tc>
           <w:tcPr>
             <w:tcW w:w="746" w:type="dxa"/>
-            <w:shd w:val="clear" w:color="auto" w:fill="6C5CE7"/>
+            <w:shd w:val="clear" w:color="auto" w:fill="0070C0"/>
           </w:tcPr>
           <w:p>
             <w:pPr>
@@ -568,7 +577,7 @@
         <w:tc>
           <w:tcPr>
             <w:tcW w:w="815" w:type="dxa"/>
-            <w:shd w:val="clear" w:color="auto" w:fill="6C5CE7"/>
+            <w:shd w:val="clear" w:color="auto" w:fill="0070C0"/>
           </w:tcPr>
           <w:p>
             <w:pPr>
@@ -587,7 +596,7 @@
         <w:tc>
           <w:tcPr>
             <w:tcW w:w="1028" w:type="dxa"/>
-            <w:shd w:val="clear" w:color="auto" w:fill="6C5CE7"/>
+            <w:shd w:val="clear" w:color="auto" w:fill="0070C0"/>
           </w:tcPr>
           <w:p>
             <w:pPr>
@@ -608,7 +617,7 @@
         <w:tc>
           <w:tcPr>
             <w:tcW w:w="866" w:type="dxa"/>
-            <w:shd w:val="clear" w:color="auto" w:fill="6C5CE7"/>
+            <w:shd w:val="clear" w:color="auto" w:fill="0070C0"/>
           </w:tcPr>
           <w:p>
             <w:pPr>
@@ -711,6 +720,7 @@
       <w:pPr>
         <w:jc w:val="right"/>
         <w:rPr>
+          <w:color w:val="0070C0"/>
           <w:sz w:val="22"/>
           <w:lang w:val="de-DE"/>
         </w:rPr>
@@ -718,7 +728,7 @@
       <w:r>
         <w:rPr>
           <w:b/>
-          <w:color w:val="6C5CE7"/>
+          <w:color w:val="0070C0"/>
           <w:sz w:val="22"/>
           <w:lang w:val="de-DE"/>
         </w:rPr>
@@ -728,7 +738,7 @@
       <w:r>
         <w:rPr>
           <w:b/>
-          <w:color w:val="6C5CE7"/>
+          <w:color w:val="0070C0"/>
           <w:sz w:val="22"/>
           <w:lang w:val="de-DE"/>
         </w:rPr>
@@ -738,7 +748,7 @@
       <w:r>
         <w:rPr>
           <w:b/>
-          <w:color w:val="6C5CE7"/>
+          <w:color w:val="0070C0"/>
           <w:sz w:val="22"/>
           <w:lang w:val="de-DE"/>
         </w:rPr>
@@ -817,6 +827,13 @@
         </w:rPr>
         <w:t>Bei Fragen stehe ich Ihnen gerne zur Verfügung.</w:t>
       </w:r>
+    </w:p>
+    <w:p>
+      <w:pPr>
+        <w:rPr>
+          <w:lang w:val="de-DE"/>
+        </w:rPr>
+      </w:pPr>
     </w:p>
     <w:p>
       <w:pPr>

</xml_diff>

<commit_message>
Vorlagen: ueberarbeitete Fusszeile vom Server uebernommen
Alle vier Word-Vorlagen (Rechnung, Angebot, Gutschrift, Mahnung) hatten auf
dem Server eine per Upload geaenderte Fusszeile, die bisher nicht im Repo war:
einzeilig mit Inhaber, Anschrift, E-Mail und Bankverbindung statt der
bisherigen zweizeiligen Variante mit Firma und Steuernummer.

Co-Authored-By: Claude Opus 5 <noreply@anthropic.com>
</commit_message>
<xml_diff>
--- a/vorlagen/vorlage_angebot.docx
+++ b/vorlagen/vorlage_angebot.docx
@@ -1,6 +1,6 @@
 
 <file path=word/document.xml><?xml version="1.0" encoding="utf-8"?>
-<w:document xmlns:wpc="http://schemas.microsoft.com/office/word/2010/wordprocessingCanvas" xmlns:cx="http://schemas.microsoft.com/office/drawing/2014/chartex" xmlns:cx1="http://schemas.microsoft.com/office/drawing/2015/9/8/chartex" xmlns:cx2="http://schemas.microsoft.com/office/drawing/2015/10/21/chartex" xmlns:cx3="http://schemas.microsoft.com/office/drawing/2016/5/9/chartex" xmlns:cx4="http://schemas.microsoft.com/office/drawing/2016/5/10/chartex" xmlns:cx5="http://schemas.microsoft.com/office/drawing/2016/5/11/chartex" xmlns:cx6="http://schemas.microsoft.com/office/drawing/2016/5/12/chartex" xmlns:cx7="http://schemas.microsoft.com/office/drawing/2016/5/13/chartex" xmlns:cx8="http://schemas.microsoft.com/office/drawing/2016/5/14/chartex" xmlns:mc="http://schemas.openxmlformats.org/markup-compatibility/2006" xmlns:aink="http://schemas.microsoft.com/office/drawing/2016/ink" xmlns:am3d="http://schemas.microsoft.com/office/drawing/2017/model3d" xmlns:o="urn:schemas-microsoft-com:office:office" xmlns:oel="http://schemas.microsoft.com/office/2019/extlst" xmlns:r="http://schemas.openxmlformats.org/officeDocument/2006/relationships" xmlns:m="http://schemas.openxmlformats.org/officeDocument/2006/math" xmlns:v="urn:schemas-microsoft-com:vml" xmlns:wp14="http://schemas.microsoft.com/office/word/2010/wordprocessingDrawing" xmlns:wp="http://schemas.openxmlformats.org/drawingml/2006/wordprocessingDrawing" xmlns:w10="urn:schemas-microsoft-com:office:word" xmlns:w="http://schemas.openxmlformats.org/wordprocessingml/2006/main" xmlns:w14="http://schemas.microsoft.com/office/word/2010/wordml" xmlns:w15="http://schemas.microsoft.com/office/word/2012/wordml" xmlns:w16cex="http://schemas.microsoft.com/office/word/2018/wordml/cex" xmlns:w16cid="http://schemas.microsoft.com/office/word/2016/wordml/cid" xmlns:w16="http://schemas.microsoft.com/office/word/2018/wordml" xmlns:w16du="http://schemas.microsoft.com/office/word/2023/wordml/word16du" xmlns:w16sdtdh="http://schemas.microsoft.com/office/word/2020/wordml/sdtdatahash" xmlns:w16sdtfl="http://schemas.microsoft.com/office/word/2024/wordml/sdtformatlock" xmlns:w16se="http://schemas.microsoft.com/office/word/2015/wordml/symex" xmlns:wpg="http://schemas.microsoft.com/office/word/2010/wordprocessingGroup" xmlns:wpi="http://schemas.microsoft.com/office/word/2010/wordprocessingInk" xmlns:wne="http://schemas.microsoft.com/office/word/2006/wordml" xmlns:wps="http://schemas.microsoft.com/office/word/2010/wordprocessingShape" mc:Ignorable="w14 w15 w16se w16cid w16 w16cex w16sdtdh w16sdtfl w16du wp14">
+<w:document xmlns:wpc="http://schemas.microsoft.com/office/word/2010/wordprocessingCanvas" xmlns:cx="http://schemas.microsoft.com/office/drawing/2014/chartex" xmlns:cx1="http://schemas.microsoft.com/office/drawing/2015/9/8/chartex" xmlns:cx2="http://schemas.microsoft.com/office/drawing/2015/10/21/chartex" xmlns:cx3="http://schemas.microsoft.com/office/drawing/2016/5/9/chartex" xmlns:cx4="http://schemas.microsoft.com/office/drawing/2016/5/10/chartex" xmlns:cx5="http://schemas.microsoft.com/office/drawing/2016/5/11/chartex" xmlns:cx6="http://schemas.microsoft.com/office/drawing/2016/5/12/chartex" xmlns:cx7="http://schemas.microsoft.com/office/drawing/2016/5/13/chartex" xmlns:cx8="http://schemas.microsoft.com/office/drawing/2016/5/14/chartex" xmlns:mc="http://schemas.openxmlformats.org/markup-compatibility/2006" xmlns:aink="http://schemas.microsoft.com/office/drawing/2016/ink" xmlns:am3d="http://schemas.microsoft.com/office/drawing/2017/model3d" xmlns:o="urn:schemas-microsoft-com:office:office" xmlns:oel="http://schemas.microsoft.com/office/2019/extlst" xmlns:r="http://schemas.openxmlformats.org/officeDocument/2006/relationships" xmlns:m="http://schemas.openxmlformats.org/officeDocument/2006/math" xmlns:v="urn:schemas-microsoft-com:vml" xmlns:wp14="http://schemas.microsoft.com/office/word/2010/wordprocessingDrawing" xmlns:wp="http://schemas.openxmlformats.org/drawingml/2006/wordprocessingDrawing" xmlns:w10="urn:schemas-microsoft-com:office:word" xmlns:w="http://schemas.openxmlformats.org/wordprocessingml/2006/main" xmlns:w14="http://schemas.microsoft.com/office/word/2010/wordml" xmlns:w15="http://schemas.microsoft.com/office/word/2012/wordml" xmlns:w16cei="http://schemas.microsoft.com/office/word/2026/wordml/cei" xmlns:w16cex="http://schemas.microsoft.com/office/word/2018/wordml/cex" xmlns:w16cid="http://schemas.microsoft.com/office/word/2016/wordml/cid" xmlns:w16="http://schemas.microsoft.com/office/word/2018/wordml" xmlns:w16du="http://schemas.microsoft.com/office/word/2023/wordml/word16du" xmlns:w16sdtdh="http://schemas.microsoft.com/office/word/2020/wordml/sdtdatahash" xmlns:w16sdtfl="http://schemas.microsoft.com/office/word/2024/wordml/sdtformatlock" xmlns:w16se="http://schemas.microsoft.com/office/word/2015/wordml/symex" xmlns:wpg="http://schemas.microsoft.com/office/word/2010/wordprocessingGroup" xmlns:wpi="http://schemas.microsoft.com/office/word/2010/wordprocessingInk" xmlns:wne="http://schemas.microsoft.com/office/word/2006/wordml" xmlns:wps="http://schemas.microsoft.com/office/word/2010/wordprocessingShape" mc:Ignorable="w14 w15 w16se w16cid w16 w16cex w16sdtdh w16sdtfl w16du wp14">
   <w:body>
     <w:p>
       <w:pPr>
@@ -510,12 +510,12 @@
         <w:tblLook w:val="04A0" w:firstRow="1" w:lastRow="0" w:firstColumn="1" w:lastColumn="0" w:noHBand="0" w:noVBand="1"/>
       </w:tblPr>
       <w:tblGrid>
-        <w:gridCol w:w="1220"/>
-        <w:gridCol w:w="5246"/>
+        <w:gridCol w:w="1219"/>
+        <w:gridCol w:w="5027"/>
         <w:gridCol w:w="745"/>
-        <w:gridCol w:w="808"/>
+        <w:gridCol w:w="805"/>
         <w:gridCol w:w="1027"/>
-        <w:gridCol w:w="859"/>
+        <w:gridCol w:w="856"/>
       </w:tblGrid>
       <w:tr>
         <w:trPr>
@@ -883,7 +883,12 @@
       </w:pPr>
     </w:p>
     <w:sectPr>
-      <w:footerReference w:type="default" r:id="rId8"/>
+      <w:headerReference w:type="even" r:id="rId8"/>
+      <w:headerReference w:type="default" r:id="rId9"/>
+      <w:footerReference w:type="even" r:id="rId10"/>
+      <w:footerReference w:type="default" r:id="rId11"/>
+      <w:headerReference w:type="first" r:id="rId12"/>
+      <w:footerReference w:type="first" r:id="rId13"/>
       <w:pgSz w:w="12240" w:h="15840"/>
       <w:pgMar w:top="568" w:right="1134" w:bottom="1134" w:left="1417" w:header="142" w:footer="362" w:gutter="0"/>
       <w:cols w:space="720"/>
@@ -894,7 +899,7 @@
 </file>
 
 <file path=word/endnotes.xml><?xml version="1.0" encoding="utf-8"?>
-<w:endnotes xmlns:wpc="http://schemas.microsoft.com/office/word/2010/wordprocessingCanvas" xmlns:cx="http://schemas.microsoft.com/office/drawing/2014/chartex" xmlns:cx1="http://schemas.microsoft.com/office/drawing/2015/9/8/chartex" xmlns:cx2="http://schemas.microsoft.com/office/drawing/2015/10/21/chartex" xmlns:cx3="http://schemas.microsoft.com/office/drawing/2016/5/9/chartex" xmlns:cx4="http://schemas.microsoft.com/office/drawing/2016/5/10/chartex" xmlns:cx5="http://schemas.microsoft.com/office/drawing/2016/5/11/chartex" xmlns:cx6="http://schemas.microsoft.com/office/drawing/2016/5/12/chartex" xmlns:cx7="http://schemas.microsoft.com/office/drawing/2016/5/13/chartex" xmlns:cx8="http://schemas.microsoft.com/office/drawing/2016/5/14/chartex" xmlns:mc="http://schemas.openxmlformats.org/markup-compatibility/2006" xmlns:aink="http://schemas.microsoft.com/office/drawing/2016/ink" xmlns:am3d="http://schemas.microsoft.com/office/drawing/2017/model3d" xmlns:o="urn:schemas-microsoft-com:office:office" xmlns:oel="http://schemas.microsoft.com/office/2019/extlst" xmlns:r="http://schemas.openxmlformats.org/officeDocument/2006/relationships" xmlns:m="http://schemas.openxmlformats.org/officeDocument/2006/math" xmlns:v="urn:schemas-microsoft-com:vml" xmlns:wp14="http://schemas.microsoft.com/office/word/2010/wordprocessingDrawing" xmlns:wp="http://schemas.openxmlformats.org/drawingml/2006/wordprocessingDrawing" xmlns:w10="urn:schemas-microsoft-com:office:word" xmlns:w="http://schemas.openxmlformats.org/wordprocessingml/2006/main" xmlns:w14="http://schemas.microsoft.com/office/word/2010/wordml" xmlns:w15="http://schemas.microsoft.com/office/word/2012/wordml" xmlns:w16cex="http://schemas.microsoft.com/office/word/2018/wordml/cex" xmlns:w16cid="http://schemas.microsoft.com/office/word/2016/wordml/cid" xmlns:w16="http://schemas.microsoft.com/office/word/2018/wordml" xmlns:w16du="http://schemas.microsoft.com/office/word/2023/wordml/word16du" xmlns:w16sdtdh="http://schemas.microsoft.com/office/word/2020/wordml/sdtdatahash" xmlns:w16sdtfl="http://schemas.microsoft.com/office/word/2024/wordml/sdtformatlock" xmlns:w16se="http://schemas.microsoft.com/office/word/2015/wordml/symex" xmlns:wpg="http://schemas.microsoft.com/office/word/2010/wordprocessingGroup" xmlns:wpi="http://schemas.microsoft.com/office/word/2010/wordprocessingInk" xmlns:wne="http://schemas.microsoft.com/office/word/2006/wordml" xmlns:wps="http://schemas.microsoft.com/office/word/2010/wordprocessingShape" mc:Ignorable="w14 w15 w16se w16cid w16 w16cex w16sdtdh w16sdtfl w16du wp14">
+<w:endnotes xmlns:wpc="http://schemas.microsoft.com/office/word/2010/wordprocessingCanvas" xmlns:cx="http://schemas.microsoft.com/office/drawing/2014/chartex" xmlns:cx1="http://schemas.microsoft.com/office/drawing/2015/9/8/chartex" xmlns:cx2="http://schemas.microsoft.com/office/drawing/2015/10/21/chartex" xmlns:cx3="http://schemas.microsoft.com/office/drawing/2016/5/9/chartex" xmlns:cx4="http://schemas.microsoft.com/office/drawing/2016/5/10/chartex" xmlns:cx5="http://schemas.microsoft.com/office/drawing/2016/5/11/chartex" xmlns:cx6="http://schemas.microsoft.com/office/drawing/2016/5/12/chartex" xmlns:cx7="http://schemas.microsoft.com/office/drawing/2016/5/13/chartex" xmlns:cx8="http://schemas.microsoft.com/office/drawing/2016/5/14/chartex" xmlns:mc="http://schemas.openxmlformats.org/markup-compatibility/2006" xmlns:aink="http://schemas.microsoft.com/office/drawing/2016/ink" xmlns:am3d="http://schemas.microsoft.com/office/drawing/2017/model3d" xmlns:o="urn:schemas-microsoft-com:office:office" xmlns:oel="http://schemas.microsoft.com/office/2019/extlst" xmlns:r="http://schemas.openxmlformats.org/officeDocument/2006/relationships" xmlns:m="http://schemas.openxmlformats.org/officeDocument/2006/math" xmlns:v="urn:schemas-microsoft-com:vml" xmlns:wp14="http://schemas.microsoft.com/office/word/2010/wordprocessingDrawing" xmlns:wp="http://schemas.openxmlformats.org/drawingml/2006/wordprocessingDrawing" xmlns:w10="urn:schemas-microsoft-com:office:word" xmlns:w="http://schemas.openxmlformats.org/wordprocessingml/2006/main" xmlns:w14="http://schemas.microsoft.com/office/word/2010/wordml" xmlns:w15="http://schemas.microsoft.com/office/word/2012/wordml" xmlns:w16cei="http://schemas.microsoft.com/office/word/2026/wordml/cei" xmlns:w16cex="http://schemas.microsoft.com/office/word/2018/wordml/cex" xmlns:w16cid="http://schemas.microsoft.com/office/word/2016/wordml/cid" xmlns:w16="http://schemas.microsoft.com/office/word/2018/wordml" xmlns:w16du="http://schemas.microsoft.com/office/word/2023/wordml/word16du" xmlns:w16sdtdh="http://schemas.microsoft.com/office/word/2020/wordml/sdtdatahash" xmlns:w16sdtfl="http://schemas.microsoft.com/office/word/2024/wordml/sdtformatlock" xmlns:w16se="http://schemas.microsoft.com/office/word/2015/wordml/symex" xmlns:wpg="http://schemas.microsoft.com/office/word/2010/wordprocessingGroup" xmlns:wpi="http://schemas.microsoft.com/office/word/2010/wordprocessingInk" xmlns:wne="http://schemas.microsoft.com/office/word/2006/wordml" xmlns:wps="http://schemas.microsoft.com/office/word/2010/wordprocessingShape" mc:Ignorable="w14 w15 w16se w16cid w16 w16cex w16sdtdh w16sdtfl w16du wp14">
   <w:endnote w:type="separator" w:id="-1">
     <w:p>
       <w:pPr>
@@ -919,19 +924,121 @@
 </file>
 
 <file path=word/footer1.xml><?xml version="1.0" encoding="utf-8"?>
-<w:ftr xmlns:wpc="http://schemas.microsoft.com/office/word/2010/wordprocessingCanvas" xmlns:cx="http://schemas.microsoft.com/office/drawing/2014/chartex" xmlns:cx1="http://schemas.microsoft.com/office/drawing/2015/9/8/chartex" xmlns:cx2="http://schemas.microsoft.com/office/drawing/2015/10/21/chartex" xmlns:cx3="http://schemas.microsoft.com/office/drawing/2016/5/9/chartex" xmlns:cx4="http://schemas.microsoft.com/office/drawing/2016/5/10/chartex" xmlns:cx5="http://schemas.microsoft.com/office/drawing/2016/5/11/chartex" xmlns:cx6="http://schemas.microsoft.com/office/drawing/2016/5/12/chartex" xmlns:cx7="http://schemas.microsoft.com/office/drawing/2016/5/13/chartex" xmlns:cx8="http://schemas.microsoft.com/office/drawing/2016/5/14/chartex" xmlns:mc="http://schemas.openxmlformats.org/markup-compatibility/2006" xmlns:aink="http://schemas.microsoft.com/office/drawing/2016/ink" xmlns:am3d="http://schemas.microsoft.com/office/drawing/2017/model3d" xmlns:o="urn:schemas-microsoft-com:office:office" xmlns:oel="http://schemas.microsoft.com/office/2019/extlst" xmlns:r="http://schemas.openxmlformats.org/officeDocument/2006/relationships" xmlns:m="http://schemas.openxmlformats.org/officeDocument/2006/math" xmlns:v="urn:schemas-microsoft-com:vml" xmlns:wp14="http://schemas.microsoft.com/office/word/2010/wordprocessingDrawing" xmlns:wp="http://schemas.openxmlformats.org/drawingml/2006/wordprocessingDrawing" xmlns:w10="urn:schemas-microsoft-com:office:word" xmlns:w="http://schemas.openxmlformats.org/wordprocessingml/2006/main" xmlns:w14="http://schemas.microsoft.com/office/word/2010/wordml" xmlns:w15="http://schemas.microsoft.com/office/word/2012/wordml" xmlns:w16cex="http://schemas.microsoft.com/office/word/2018/wordml/cex" xmlns:w16cid="http://schemas.microsoft.com/office/word/2016/wordml/cid" xmlns:w16="http://schemas.microsoft.com/office/word/2018/wordml" xmlns:w16du="http://schemas.microsoft.com/office/word/2023/wordml/word16du" xmlns:w16sdtdh="http://schemas.microsoft.com/office/word/2020/wordml/sdtdatahash" xmlns:w16sdtfl="http://schemas.microsoft.com/office/word/2024/wordml/sdtformatlock" xmlns:w16se="http://schemas.microsoft.com/office/word/2015/wordml/symex" xmlns:wpg="http://schemas.microsoft.com/office/word/2010/wordprocessingGroup" xmlns:wpi="http://schemas.microsoft.com/office/word/2010/wordprocessingInk" xmlns:wne="http://schemas.microsoft.com/office/word/2006/wordml" xmlns:wps="http://schemas.microsoft.com/office/word/2010/wordprocessingShape" mc:Ignorable="w14 w15 w16se w16cid w16 w16cex w16sdtdh w16sdtfl w16du wp14">
+<w:ftr xmlns:wpc="http://schemas.microsoft.com/office/word/2010/wordprocessingCanvas" xmlns:cx="http://schemas.microsoft.com/office/drawing/2014/chartex" xmlns:cx1="http://schemas.microsoft.com/office/drawing/2015/9/8/chartex" xmlns:cx2="http://schemas.microsoft.com/office/drawing/2015/10/21/chartex" xmlns:cx3="http://schemas.microsoft.com/office/drawing/2016/5/9/chartex" xmlns:cx4="http://schemas.microsoft.com/office/drawing/2016/5/10/chartex" xmlns:cx5="http://schemas.microsoft.com/office/drawing/2016/5/11/chartex" xmlns:cx6="http://schemas.microsoft.com/office/drawing/2016/5/12/chartex" xmlns:cx7="http://schemas.microsoft.com/office/drawing/2016/5/13/chartex" xmlns:cx8="http://schemas.microsoft.com/office/drawing/2016/5/14/chartex" xmlns:mc="http://schemas.openxmlformats.org/markup-compatibility/2006" xmlns:aink="http://schemas.microsoft.com/office/drawing/2016/ink" xmlns:am3d="http://schemas.microsoft.com/office/drawing/2017/model3d" xmlns:o="urn:schemas-microsoft-com:office:office" xmlns:oel="http://schemas.microsoft.com/office/2019/extlst" xmlns:r="http://schemas.openxmlformats.org/officeDocument/2006/relationships" xmlns:m="http://schemas.openxmlformats.org/officeDocument/2006/math" xmlns:v="urn:schemas-microsoft-com:vml" xmlns:wp14="http://schemas.microsoft.com/office/word/2010/wordprocessingDrawing" xmlns:wp="http://schemas.openxmlformats.org/drawingml/2006/wordprocessingDrawing" xmlns:w10="urn:schemas-microsoft-com:office:word" xmlns:w="http://schemas.openxmlformats.org/wordprocessingml/2006/main" xmlns:w14="http://schemas.microsoft.com/office/word/2010/wordml" xmlns:w15="http://schemas.microsoft.com/office/word/2012/wordml" xmlns:w16cei="http://schemas.microsoft.com/office/word/2026/wordml/cei" xmlns:w16cex="http://schemas.microsoft.com/office/word/2018/wordml/cex" xmlns:w16cid="http://schemas.microsoft.com/office/word/2016/wordml/cid" xmlns:w16="http://schemas.microsoft.com/office/word/2018/wordml" xmlns:w16du="http://schemas.microsoft.com/office/word/2023/wordml/word16du" xmlns:w16sdtdh="http://schemas.microsoft.com/office/word/2020/wordml/sdtdatahash" xmlns:w16sdtfl="http://schemas.microsoft.com/office/word/2024/wordml/sdtformatlock" xmlns:w16se="http://schemas.microsoft.com/office/word/2015/wordml/symex" xmlns:wpg="http://schemas.microsoft.com/office/word/2010/wordprocessingGroup" xmlns:wpi="http://schemas.microsoft.com/office/word/2010/wordprocessingInk" xmlns:wne="http://schemas.microsoft.com/office/word/2006/wordml" xmlns:wps="http://schemas.microsoft.com/office/word/2010/wordprocessingShape" mc:Ignorable="w14 w15 w16se w16cid w16 w16cex w16sdtdh w16sdtfl w16du wp14">
   <w:p>
     <w:pPr>
+      <w:pStyle w:val="Fuzeile"/>
+    </w:pPr>
+  </w:p>
+</w:ftr>
+</file>
+
+<file path=word/footer2.xml><?xml version="1.0" encoding="utf-8"?>
+<w:ftr xmlns:wpc="http://schemas.microsoft.com/office/word/2010/wordprocessingCanvas" xmlns:cx="http://schemas.microsoft.com/office/drawing/2014/chartex" xmlns:cx1="http://schemas.microsoft.com/office/drawing/2015/9/8/chartex" xmlns:cx2="http://schemas.microsoft.com/office/drawing/2015/10/21/chartex" xmlns:cx3="http://schemas.microsoft.com/office/drawing/2016/5/9/chartex" xmlns:cx4="http://schemas.microsoft.com/office/drawing/2016/5/10/chartex" xmlns:cx5="http://schemas.microsoft.com/office/drawing/2016/5/11/chartex" xmlns:cx6="http://schemas.microsoft.com/office/drawing/2016/5/12/chartex" xmlns:cx7="http://schemas.microsoft.com/office/drawing/2016/5/13/chartex" xmlns:cx8="http://schemas.microsoft.com/office/drawing/2016/5/14/chartex" xmlns:mc="http://schemas.openxmlformats.org/markup-compatibility/2006" xmlns:aink="http://schemas.microsoft.com/office/drawing/2016/ink" xmlns:am3d="http://schemas.microsoft.com/office/drawing/2017/model3d" xmlns:o="urn:schemas-microsoft-com:office:office" xmlns:oel="http://schemas.microsoft.com/office/2019/extlst" xmlns:r="http://schemas.openxmlformats.org/officeDocument/2006/relationships" xmlns:m="http://schemas.openxmlformats.org/officeDocument/2006/math" xmlns:v="urn:schemas-microsoft-com:vml" xmlns:wp14="http://schemas.microsoft.com/office/word/2010/wordprocessingDrawing" xmlns:wp="http://schemas.openxmlformats.org/drawingml/2006/wordprocessingDrawing" xmlns:w10="urn:schemas-microsoft-com:office:word" xmlns:w="http://schemas.openxmlformats.org/wordprocessingml/2006/main" xmlns:w14="http://schemas.microsoft.com/office/word/2010/wordml" xmlns:w15="http://schemas.microsoft.com/office/word/2012/wordml" xmlns:w16cei="http://schemas.microsoft.com/office/word/2026/wordml/cei" xmlns:w16cex="http://schemas.microsoft.com/office/word/2018/wordml/cex" xmlns:w16cid="http://schemas.microsoft.com/office/word/2016/wordml/cid" xmlns:w16="http://schemas.microsoft.com/office/word/2018/wordml" xmlns:w16du="http://schemas.microsoft.com/office/word/2023/wordml/word16du" xmlns:w16sdtdh="http://schemas.microsoft.com/office/word/2020/wordml/sdtdatahash" xmlns:w16sdtfl="http://schemas.microsoft.com/office/word/2024/wordml/sdtformatlock" xmlns:w16se="http://schemas.microsoft.com/office/word/2015/wordml/symex" xmlns:wpg="http://schemas.microsoft.com/office/word/2010/wordprocessingGroup" xmlns:wpi="http://schemas.microsoft.com/office/word/2010/wordprocessingInk" xmlns:wne="http://schemas.microsoft.com/office/word/2006/wordml" xmlns:wps="http://schemas.microsoft.com/office/word/2010/wordprocessingShape" mc:Ignorable="w14 w15 w16se w16cid w16 w16cex w16sdtdh w16sdtfl w16du wp14">
+  <w:p>
+    <w:pPr>
+      <w:pStyle w:val="Fuzeile"/>
       <w:pBdr>
-        <w:top w:val="single" w:sz="4" w:space="4" w:color="CCCCCC"/>
+        <w:top w:val="single" w:sz="4" w:space="1" w:color="auto"/>
       </w:pBdr>
+      <w:jc w:val="right"/>
+      <w:rPr>
+        <w:color w:val="888888"/>
+      </w:rPr>
     </w:pPr>
     <w:r>
       <w:rPr>
+        <w:b/>
+        <w:bCs/>
         <w:color w:val="888888"/>
         <w:lang w:val="de-DE"/>
       </w:rPr>
-      <w:t>Bankverbindung: {{</w:t>
+      <w:t>Inhaber:</w:t>
+    </w:r>
+    <w:r>
+      <w:rPr>
+        <w:color w:val="888888"/>
+        <w:lang w:val="de-DE"/>
+      </w:rPr>
+      <w:t xml:space="preserve"> </w:t>
+    </w:r>
+    <w:r>
+      <w:rPr>
+        <w:color w:val="888888"/>
+      </w:rPr>
+      <w:t>{{</w:t>
+    </w:r>
+    <w:proofErr w:type="spellStart"/>
+    <w:r>
+      <w:rPr>
+        <w:color w:val="888888"/>
+      </w:rPr>
+      <w:t>inhaber</w:t>
+    </w:r>
+    <w:proofErr w:type="spellEnd"/>
+    <w:r>
+      <w:rPr>
+        <w:color w:val="888888"/>
+      </w:rPr>
+      <w:t>}}</w:t>
+    </w:r>
+    <w:r>
+      <w:rPr>
+        <w:color w:val="888888"/>
+        <w:lang w:val="de-DE"/>
+      </w:rPr>
+      <w:t xml:space="preserve"> ·  Hirschbergstr. 4 · 34123 Kassel · </w:t>
+    </w:r>
+    <w:r>
+      <w:rPr>
+        <w:color w:val="888888"/>
+      </w:rPr>
+      <w:t>{{</w:t>
+    </w:r>
+    <w:proofErr w:type="spellStart"/>
+    <w:r>
+      <w:rPr>
+        <w:color w:val="888888"/>
+      </w:rPr>
+      <w:t>firma_</w:t>
+    </w:r>
+    <w:proofErr w:type="gramStart"/>
+    <w:r>
+      <w:rPr>
+        <w:color w:val="888888"/>
+      </w:rPr>
+      <w:t>email</w:t>
+    </w:r>
+    <w:proofErr w:type="spellEnd"/>
+    <w:proofErr w:type="gramEnd"/>
+    <w:r>
+      <w:rPr>
+        <w:color w:val="888888"/>
+      </w:rPr>
+      <w:t>}}</w:t>
+    </w:r>
+    <w:r>
+      <w:rPr>
+        <w:color w:val="888888"/>
+        <w:lang w:val="de-DE"/>
+      </w:rPr>
+      <w:t xml:space="preserve"> · </w:t>
+    </w:r>
+    <w:r>
+      <w:rPr>
+        <w:b/>
+        <w:bCs/>
+        <w:color w:val="888888"/>
+        <w:lang w:val="de-DE"/>
+      </w:rPr>
+      <w:t>Bankverbindung:</w:t>
+    </w:r>
+    <w:r>
+      <w:rPr>
+        <w:color w:val="888888"/>
+        <w:lang w:val="de-DE"/>
+      </w:rPr>
+      <w:t xml:space="preserve"> {{</w:t>
     </w:r>
     <w:proofErr w:type="spellStart"/>
     <w:r>
@@ -978,75 +1085,6 @@
       <w:rPr>
         <w:color w:val="888888"/>
         <w:lang w:val="de-DE"/>
-      </w:rPr>
-      <w:t>}}</w:t>
-    </w:r>
-    <w:r>
-      <w:rPr>
-        <w:color w:val="888888"/>
-        <w:lang w:val="de-DE"/>
-      </w:rPr>
-      <w:br/>
-    </w:r>
-    <w:r>
-      <w:rPr>
-        <w:color w:val="888888"/>
-      </w:rPr>
-      <w:t>{{</w:t>
-    </w:r>
-    <w:proofErr w:type="spellStart"/>
-    <w:r>
-      <w:rPr>
-        <w:color w:val="888888"/>
-      </w:rPr>
-      <w:t>firma</w:t>
-    </w:r>
-    <w:proofErr w:type="spellEnd"/>
-    <w:r>
-      <w:rPr>
-        <w:color w:val="888888"/>
-      </w:rPr>
-      <w:t>}} · {{</w:t>
-    </w:r>
-    <w:proofErr w:type="spellStart"/>
-    <w:r>
-      <w:rPr>
-        <w:color w:val="888888"/>
-      </w:rPr>
-      <w:t>inhaber</w:t>
-    </w:r>
-    <w:proofErr w:type="spellEnd"/>
-    <w:r>
-      <w:rPr>
-        <w:color w:val="888888"/>
-      </w:rPr>
-      <w:t xml:space="preserve">}} · </w:t>
-    </w:r>
-    <w:proofErr w:type="spellStart"/>
-    <w:r>
-      <w:rPr>
-        <w:color w:val="888888"/>
-      </w:rPr>
-      <w:t>Steuernummer</w:t>
-    </w:r>
-    <w:proofErr w:type="spellEnd"/>
-    <w:r>
-      <w:rPr>
-        <w:color w:val="888888"/>
-      </w:rPr>
-      <w:t>: {{</w:t>
-    </w:r>
-    <w:proofErr w:type="spellStart"/>
-    <w:r>
-      <w:rPr>
-        <w:color w:val="888888"/>
-      </w:rPr>
-      <w:t>steuernummer</w:t>
-    </w:r>
-    <w:proofErr w:type="spellEnd"/>
-    <w:r>
-      <w:rPr>
-        <w:color w:val="888888"/>
       </w:rPr>
       <w:t>}}</w:t>
     </w:r>
@@ -1054,8 +1092,18 @@
 </w:ftr>
 </file>
 
+<file path=word/footer3.xml><?xml version="1.0" encoding="utf-8"?>
+<w:ftr xmlns:wpc="http://schemas.microsoft.com/office/word/2010/wordprocessingCanvas" xmlns:cx="http://schemas.microsoft.com/office/drawing/2014/chartex" xmlns:cx1="http://schemas.microsoft.com/office/drawing/2015/9/8/chartex" xmlns:cx2="http://schemas.microsoft.com/office/drawing/2015/10/21/chartex" xmlns:cx3="http://schemas.microsoft.com/office/drawing/2016/5/9/chartex" xmlns:cx4="http://schemas.microsoft.com/office/drawing/2016/5/10/chartex" xmlns:cx5="http://schemas.microsoft.com/office/drawing/2016/5/11/chartex" xmlns:cx6="http://schemas.microsoft.com/office/drawing/2016/5/12/chartex" xmlns:cx7="http://schemas.microsoft.com/office/drawing/2016/5/13/chartex" xmlns:cx8="http://schemas.microsoft.com/office/drawing/2016/5/14/chartex" xmlns:mc="http://schemas.openxmlformats.org/markup-compatibility/2006" xmlns:aink="http://schemas.microsoft.com/office/drawing/2016/ink" xmlns:am3d="http://schemas.microsoft.com/office/drawing/2017/model3d" xmlns:o="urn:schemas-microsoft-com:office:office" xmlns:oel="http://schemas.microsoft.com/office/2019/extlst" xmlns:r="http://schemas.openxmlformats.org/officeDocument/2006/relationships" xmlns:m="http://schemas.openxmlformats.org/officeDocument/2006/math" xmlns:v="urn:schemas-microsoft-com:vml" xmlns:wp14="http://schemas.microsoft.com/office/word/2010/wordprocessingDrawing" xmlns:wp="http://schemas.openxmlformats.org/drawingml/2006/wordprocessingDrawing" xmlns:w10="urn:schemas-microsoft-com:office:word" xmlns:w="http://schemas.openxmlformats.org/wordprocessingml/2006/main" xmlns:w14="http://schemas.microsoft.com/office/word/2010/wordml" xmlns:w15="http://schemas.microsoft.com/office/word/2012/wordml" xmlns:w16cei="http://schemas.microsoft.com/office/word/2026/wordml/cei" xmlns:w16cex="http://schemas.microsoft.com/office/word/2018/wordml/cex" xmlns:w16cid="http://schemas.microsoft.com/office/word/2016/wordml/cid" xmlns:w16="http://schemas.microsoft.com/office/word/2018/wordml" xmlns:w16du="http://schemas.microsoft.com/office/word/2023/wordml/word16du" xmlns:w16sdtdh="http://schemas.microsoft.com/office/word/2020/wordml/sdtdatahash" xmlns:w16sdtfl="http://schemas.microsoft.com/office/word/2024/wordml/sdtformatlock" xmlns:w16se="http://schemas.microsoft.com/office/word/2015/wordml/symex" xmlns:wpg="http://schemas.microsoft.com/office/word/2010/wordprocessingGroup" xmlns:wpi="http://schemas.microsoft.com/office/word/2010/wordprocessingInk" xmlns:wne="http://schemas.microsoft.com/office/word/2006/wordml" xmlns:wps="http://schemas.microsoft.com/office/word/2010/wordprocessingShape" mc:Ignorable="w14 w15 w16se w16cid w16 w16cex w16sdtdh w16sdtfl w16du wp14">
+  <w:p>
+    <w:pPr>
+      <w:pStyle w:val="Fuzeile"/>
+    </w:pPr>
+  </w:p>
+</w:ftr>
+</file>
+
 <file path=word/footnotes.xml><?xml version="1.0" encoding="utf-8"?>
-<w:footnotes xmlns:wpc="http://schemas.microsoft.com/office/word/2010/wordprocessingCanvas" xmlns:cx="http://schemas.microsoft.com/office/drawing/2014/chartex" xmlns:cx1="http://schemas.microsoft.com/office/drawing/2015/9/8/chartex" xmlns:cx2="http://schemas.microsoft.com/office/drawing/2015/10/21/chartex" xmlns:cx3="http://schemas.microsoft.com/office/drawing/2016/5/9/chartex" xmlns:cx4="http://schemas.microsoft.com/office/drawing/2016/5/10/chartex" xmlns:cx5="http://schemas.microsoft.com/office/drawing/2016/5/11/chartex" xmlns:cx6="http://schemas.microsoft.com/office/drawing/2016/5/12/chartex" xmlns:cx7="http://schemas.microsoft.com/office/drawing/2016/5/13/chartex" xmlns:cx8="http://schemas.microsoft.com/office/drawing/2016/5/14/chartex" xmlns:mc="http://schemas.openxmlformats.org/markup-compatibility/2006" xmlns:aink="http://schemas.microsoft.com/office/drawing/2016/ink" xmlns:am3d="http://schemas.microsoft.com/office/drawing/2017/model3d" xmlns:o="urn:schemas-microsoft-com:office:office" xmlns:oel="http://schemas.microsoft.com/office/2019/extlst" xmlns:r="http://schemas.openxmlformats.org/officeDocument/2006/relationships" xmlns:m="http://schemas.openxmlformats.org/officeDocument/2006/math" xmlns:v="urn:schemas-microsoft-com:vml" xmlns:wp14="http://schemas.microsoft.com/office/word/2010/wordprocessingDrawing" xmlns:wp="http://schemas.openxmlformats.org/drawingml/2006/wordprocessingDrawing" xmlns:w10="urn:schemas-microsoft-com:office:word" xmlns:w="http://schemas.openxmlformats.org/wordprocessingml/2006/main" xmlns:w14="http://schemas.microsoft.com/office/word/2010/wordml" xmlns:w15="http://schemas.microsoft.com/office/word/2012/wordml" xmlns:w16cex="http://schemas.microsoft.com/office/word/2018/wordml/cex" xmlns:w16cid="http://schemas.microsoft.com/office/word/2016/wordml/cid" xmlns:w16="http://schemas.microsoft.com/office/word/2018/wordml" xmlns:w16du="http://schemas.microsoft.com/office/word/2023/wordml/word16du" xmlns:w16sdtdh="http://schemas.microsoft.com/office/word/2020/wordml/sdtdatahash" xmlns:w16sdtfl="http://schemas.microsoft.com/office/word/2024/wordml/sdtformatlock" xmlns:w16se="http://schemas.microsoft.com/office/word/2015/wordml/symex" xmlns:wpg="http://schemas.microsoft.com/office/word/2010/wordprocessingGroup" xmlns:wpi="http://schemas.microsoft.com/office/word/2010/wordprocessingInk" xmlns:wne="http://schemas.microsoft.com/office/word/2006/wordml" xmlns:wps="http://schemas.microsoft.com/office/word/2010/wordprocessingShape" mc:Ignorable="w14 w15 w16se w16cid w16 w16cex w16sdtdh w16sdtfl w16du wp14">
+<w:footnotes xmlns:wpc="http://schemas.microsoft.com/office/word/2010/wordprocessingCanvas" xmlns:cx="http://schemas.microsoft.com/office/drawing/2014/chartex" xmlns:cx1="http://schemas.microsoft.com/office/drawing/2015/9/8/chartex" xmlns:cx2="http://schemas.microsoft.com/office/drawing/2015/10/21/chartex" xmlns:cx3="http://schemas.microsoft.com/office/drawing/2016/5/9/chartex" xmlns:cx4="http://schemas.microsoft.com/office/drawing/2016/5/10/chartex" xmlns:cx5="http://schemas.microsoft.com/office/drawing/2016/5/11/chartex" xmlns:cx6="http://schemas.microsoft.com/office/drawing/2016/5/12/chartex" xmlns:cx7="http://schemas.microsoft.com/office/drawing/2016/5/13/chartex" xmlns:cx8="http://schemas.microsoft.com/office/drawing/2016/5/14/chartex" xmlns:mc="http://schemas.openxmlformats.org/markup-compatibility/2006" xmlns:aink="http://schemas.microsoft.com/office/drawing/2016/ink" xmlns:am3d="http://schemas.microsoft.com/office/drawing/2017/model3d" xmlns:o="urn:schemas-microsoft-com:office:office" xmlns:oel="http://schemas.microsoft.com/office/2019/extlst" xmlns:r="http://schemas.openxmlformats.org/officeDocument/2006/relationships" xmlns:m="http://schemas.openxmlformats.org/officeDocument/2006/math" xmlns:v="urn:schemas-microsoft-com:vml" xmlns:wp14="http://schemas.microsoft.com/office/word/2010/wordprocessingDrawing" xmlns:wp="http://schemas.openxmlformats.org/drawingml/2006/wordprocessingDrawing" xmlns:w10="urn:schemas-microsoft-com:office:word" xmlns:w="http://schemas.openxmlformats.org/wordprocessingml/2006/main" xmlns:w14="http://schemas.microsoft.com/office/word/2010/wordml" xmlns:w15="http://schemas.microsoft.com/office/word/2012/wordml" xmlns:w16cei="http://schemas.microsoft.com/office/word/2026/wordml/cei" xmlns:w16cex="http://schemas.microsoft.com/office/word/2018/wordml/cex" xmlns:w16cid="http://schemas.microsoft.com/office/word/2016/wordml/cid" xmlns:w16="http://schemas.microsoft.com/office/word/2018/wordml" xmlns:w16du="http://schemas.microsoft.com/office/word/2023/wordml/word16du" xmlns:w16sdtdh="http://schemas.microsoft.com/office/word/2020/wordml/sdtdatahash" xmlns:w16sdtfl="http://schemas.microsoft.com/office/word/2024/wordml/sdtformatlock" xmlns:w16se="http://schemas.microsoft.com/office/word/2015/wordml/symex" xmlns:wpg="http://schemas.microsoft.com/office/word/2010/wordprocessingGroup" xmlns:wpi="http://schemas.microsoft.com/office/word/2010/wordprocessingInk" xmlns:wne="http://schemas.microsoft.com/office/word/2006/wordml" xmlns:wps="http://schemas.microsoft.com/office/word/2010/wordprocessingShape" mc:Ignorable="w14 w15 w16se w16cid w16 w16cex w16sdtdh w16sdtfl w16du wp14">
   <w:footnote w:type="separator" w:id="-1">
     <w:p>
       <w:pPr>
@@ -1079,8 +1127,38 @@
 </w:footnotes>
 </file>
 
+<file path=word/header1.xml><?xml version="1.0" encoding="utf-8"?>
+<w:hdr xmlns:wpc="http://schemas.microsoft.com/office/word/2010/wordprocessingCanvas" xmlns:cx="http://schemas.microsoft.com/office/drawing/2014/chartex" xmlns:cx1="http://schemas.microsoft.com/office/drawing/2015/9/8/chartex" xmlns:cx2="http://schemas.microsoft.com/office/drawing/2015/10/21/chartex" xmlns:cx3="http://schemas.microsoft.com/office/drawing/2016/5/9/chartex" xmlns:cx4="http://schemas.microsoft.com/office/drawing/2016/5/10/chartex" xmlns:cx5="http://schemas.microsoft.com/office/drawing/2016/5/11/chartex" xmlns:cx6="http://schemas.microsoft.com/office/drawing/2016/5/12/chartex" xmlns:cx7="http://schemas.microsoft.com/office/drawing/2016/5/13/chartex" xmlns:cx8="http://schemas.microsoft.com/office/drawing/2016/5/14/chartex" xmlns:mc="http://schemas.openxmlformats.org/markup-compatibility/2006" xmlns:aink="http://schemas.microsoft.com/office/drawing/2016/ink" xmlns:am3d="http://schemas.microsoft.com/office/drawing/2017/model3d" xmlns:o="urn:schemas-microsoft-com:office:office" xmlns:oel="http://schemas.microsoft.com/office/2019/extlst" xmlns:r="http://schemas.openxmlformats.org/officeDocument/2006/relationships" xmlns:m="http://schemas.openxmlformats.org/officeDocument/2006/math" xmlns:v="urn:schemas-microsoft-com:vml" xmlns:wp14="http://schemas.microsoft.com/office/word/2010/wordprocessingDrawing" xmlns:wp="http://schemas.openxmlformats.org/drawingml/2006/wordprocessingDrawing" xmlns:w10="urn:schemas-microsoft-com:office:word" xmlns:w="http://schemas.openxmlformats.org/wordprocessingml/2006/main" xmlns:w14="http://schemas.microsoft.com/office/word/2010/wordml" xmlns:w15="http://schemas.microsoft.com/office/word/2012/wordml" xmlns:w16cei="http://schemas.microsoft.com/office/word/2026/wordml/cei" xmlns:w16cex="http://schemas.microsoft.com/office/word/2018/wordml/cex" xmlns:w16cid="http://schemas.microsoft.com/office/word/2016/wordml/cid" xmlns:w16="http://schemas.microsoft.com/office/word/2018/wordml" xmlns:w16du="http://schemas.microsoft.com/office/word/2023/wordml/word16du" xmlns:w16sdtdh="http://schemas.microsoft.com/office/word/2020/wordml/sdtdatahash" xmlns:w16sdtfl="http://schemas.microsoft.com/office/word/2024/wordml/sdtformatlock" xmlns:w16se="http://schemas.microsoft.com/office/word/2015/wordml/symex" xmlns:wpg="http://schemas.microsoft.com/office/word/2010/wordprocessingGroup" xmlns:wpi="http://schemas.microsoft.com/office/word/2010/wordprocessingInk" xmlns:wne="http://schemas.microsoft.com/office/word/2006/wordml" xmlns:wps="http://schemas.microsoft.com/office/word/2010/wordprocessingShape" mc:Ignorable="w14 w15 w16se w16cid w16 w16cex w16sdtdh w16sdtfl w16du wp14">
+  <w:p>
+    <w:pPr>
+      <w:pStyle w:val="Kopfzeile"/>
+    </w:pPr>
+  </w:p>
+</w:hdr>
+</file>
+
+<file path=word/header2.xml><?xml version="1.0" encoding="utf-8"?>
+<w:hdr xmlns:wpc="http://schemas.microsoft.com/office/word/2010/wordprocessingCanvas" xmlns:cx="http://schemas.microsoft.com/office/drawing/2014/chartex" xmlns:cx1="http://schemas.microsoft.com/office/drawing/2015/9/8/chartex" xmlns:cx2="http://schemas.microsoft.com/office/drawing/2015/10/21/chartex" xmlns:cx3="http://schemas.microsoft.com/office/drawing/2016/5/9/chartex" xmlns:cx4="http://schemas.microsoft.com/office/drawing/2016/5/10/chartex" xmlns:cx5="http://schemas.microsoft.com/office/drawing/2016/5/11/chartex" xmlns:cx6="http://schemas.microsoft.com/office/drawing/2016/5/12/chartex" xmlns:cx7="http://schemas.microsoft.com/office/drawing/2016/5/13/chartex" xmlns:cx8="http://schemas.microsoft.com/office/drawing/2016/5/14/chartex" xmlns:mc="http://schemas.openxmlformats.org/markup-compatibility/2006" xmlns:aink="http://schemas.microsoft.com/office/drawing/2016/ink" xmlns:am3d="http://schemas.microsoft.com/office/drawing/2017/model3d" xmlns:o="urn:schemas-microsoft-com:office:office" xmlns:oel="http://schemas.microsoft.com/office/2019/extlst" xmlns:r="http://schemas.openxmlformats.org/officeDocument/2006/relationships" xmlns:m="http://schemas.openxmlformats.org/officeDocument/2006/math" xmlns:v="urn:schemas-microsoft-com:vml" xmlns:wp14="http://schemas.microsoft.com/office/word/2010/wordprocessingDrawing" xmlns:wp="http://schemas.openxmlformats.org/drawingml/2006/wordprocessingDrawing" xmlns:w10="urn:schemas-microsoft-com:office:word" xmlns:w="http://schemas.openxmlformats.org/wordprocessingml/2006/main" xmlns:w14="http://schemas.microsoft.com/office/word/2010/wordml" xmlns:w15="http://schemas.microsoft.com/office/word/2012/wordml" xmlns:w16cei="http://schemas.microsoft.com/office/word/2026/wordml/cei" xmlns:w16cex="http://schemas.microsoft.com/office/word/2018/wordml/cex" xmlns:w16cid="http://schemas.microsoft.com/office/word/2016/wordml/cid" xmlns:w16="http://schemas.microsoft.com/office/word/2018/wordml" xmlns:w16du="http://schemas.microsoft.com/office/word/2023/wordml/word16du" xmlns:w16sdtdh="http://schemas.microsoft.com/office/word/2020/wordml/sdtdatahash" xmlns:w16sdtfl="http://schemas.microsoft.com/office/word/2024/wordml/sdtformatlock" xmlns:w16se="http://schemas.microsoft.com/office/word/2015/wordml/symex" xmlns:wpg="http://schemas.microsoft.com/office/word/2010/wordprocessingGroup" xmlns:wpi="http://schemas.microsoft.com/office/word/2010/wordprocessingInk" xmlns:wne="http://schemas.microsoft.com/office/word/2006/wordml" xmlns:wps="http://schemas.microsoft.com/office/word/2010/wordprocessingShape" mc:Ignorable="w14 w15 w16se w16cid w16 w16cex w16sdtdh w16sdtfl w16du wp14">
+  <w:p>
+    <w:pPr>
+      <w:pStyle w:val="Kopfzeile"/>
+    </w:pPr>
+  </w:p>
+</w:hdr>
+</file>
+
+<file path=word/header3.xml><?xml version="1.0" encoding="utf-8"?>
+<w:hdr xmlns:wpc="http://schemas.microsoft.com/office/word/2010/wordprocessingCanvas" xmlns:cx="http://schemas.microsoft.com/office/drawing/2014/chartex" xmlns:cx1="http://schemas.microsoft.com/office/drawing/2015/9/8/chartex" xmlns:cx2="http://schemas.microsoft.com/office/drawing/2015/10/21/chartex" xmlns:cx3="http://schemas.microsoft.com/office/drawing/2016/5/9/chartex" xmlns:cx4="http://schemas.microsoft.com/office/drawing/2016/5/10/chartex" xmlns:cx5="http://schemas.microsoft.com/office/drawing/2016/5/11/chartex" xmlns:cx6="http://schemas.microsoft.com/office/drawing/2016/5/12/chartex" xmlns:cx7="http://schemas.microsoft.com/office/drawing/2016/5/13/chartex" xmlns:cx8="http://schemas.microsoft.com/office/drawing/2016/5/14/chartex" xmlns:mc="http://schemas.openxmlformats.org/markup-compatibility/2006" xmlns:aink="http://schemas.microsoft.com/office/drawing/2016/ink" xmlns:am3d="http://schemas.microsoft.com/office/drawing/2017/model3d" xmlns:o="urn:schemas-microsoft-com:office:office" xmlns:oel="http://schemas.microsoft.com/office/2019/extlst" xmlns:r="http://schemas.openxmlformats.org/officeDocument/2006/relationships" xmlns:m="http://schemas.openxmlformats.org/officeDocument/2006/math" xmlns:v="urn:schemas-microsoft-com:vml" xmlns:wp14="http://schemas.microsoft.com/office/word/2010/wordprocessingDrawing" xmlns:wp="http://schemas.openxmlformats.org/drawingml/2006/wordprocessingDrawing" xmlns:w10="urn:schemas-microsoft-com:office:word" xmlns:w="http://schemas.openxmlformats.org/wordprocessingml/2006/main" xmlns:w14="http://schemas.microsoft.com/office/word/2010/wordml" xmlns:w15="http://schemas.microsoft.com/office/word/2012/wordml" xmlns:w16cei="http://schemas.microsoft.com/office/word/2026/wordml/cei" xmlns:w16cex="http://schemas.microsoft.com/office/word/2018/wordml/cex" xmlns:w16cid="http://schemas.microsoft.com/office/word/2016/wordml/cid" xmlns:w16="http://schemas.microsoft.com/office/word/2018/wordml" xmlns:w16du="http://schemas.microsoft.com/office/word/2023/wordml/word16du" xmlns:w16sdtdh="http://schemas.microsoft.com/office/word/2020/wordml/sdtdatahash" xmlns:w16sdtfl="http://schemas.microsoft.com/office/word/2024/wordml/sdtformatlock" xmlns:w16se="http://schemas.microsoft.com/office/word/2015/wordml/symex" xmlns:wpg="http://schemas.microsoft.com/office/word/2010/wordprocessingGroup" xmlns:wpi="http://schemas.microsoft.com/office/word/2010/wordprocessingInk" xmlns:wne="http://schemas.microsoft.com/office/word/2006/wordml" xmlns:wps="http://schemas.microsoft.com/office/word/2010/wordprocessingShape" mc:Ignorable="w14 w15 w16se w16cid w16 w16cex w16sdtdh w16sdtfl w16du wp14">
+  <w:p>
+    <w:pPr>
+      <w:pStyle w:val="Kopfzeile"/>
+    </w:pPr>
+  </w:p>
+</w:hdr>
+</file>
+
 <file path=word/numbering.xml><?xml version="1.0" encoding="utf-8"?>
-<w:numbering xmlns:wpc="http://schemas.microsoft.com/office/word/2010/wordprocessingCanvas" xmlns:cx="http://schemas.microsoft.com/office/drawing/2014/chartex" xmlns:cx1="http://schemas.microsoft.com/office/drawing/2015/9/8/chartex" xmlns:cx2="http://schemas.microsoft.com/office/drawing/2015/10/21/chartex" xmlns:cx3="http://schemas.microsoft.com/office/drawing/2016/5/9/chartex" xmlns:cx4="http://schemas.microsoft.com/office/drawing/2016/5/10/chartex" xmlns:cx5="http://schemas.microsoft.com/office/drawing/2016/5/11/chartex" xmlns:cx6="http://schemas.microsoft.com/office/drawing/2016/5/12/chartex" xmlns:cx7="http://schemas.microsoft.com/office/drawing/2016/5/13/chartex" xmlns:cx8="http://schemas.microsoft.com/office/drawing/2016/5/14/chartex" xmlns:mc="http://schemas.openxmlformats.org/markup-compatibility/2006" xmlns:aink="http://schemas.microsoft.com/office/drawing/2016/ink" xmlns:am3d="http://schemas.microsoft.com/office/drawing/2017/model3d" xmlns:o="urn:schemas-microsoft-com:office:office" xmlns:oel="http://schemas.microsoft.com/office/2019/extlst" xmlns:r="http://schemas.openxmlformats.org/officeDocument/2006/relationships" xmlns:m="http://schemas.openxmlformats.org/officeDocument/2006/math" xmlns:v="urn:schemas-microsoft-com:vml" xmlns:wp14="http://schemas.microsoft.com/office/word/2010/wordprocessingDrawing" xmlns:wp="http://schemas.openxmlformats.org/drawingml/2006/wordprocessingDrawing" xmlns:w10="urn:schemas-microsoft-com:office:word" xmlns:w="http://schemas.openxmlformats.org/wordprocessingml/2006/main" xmlns:w14="http://schemas.microsoft.com/office/word/2010/wordml" xmlns:w15="http://schemas.microsoft.com/office/word/2012/wordml" xmlns:w16cex="http://schemas.microsoft.com/office/word/2018/wordml/cex" xmlns:w16cid="http://schemas.microsoft.com/office/word/2016/wordml/cid" xmlns:w16="http://schemas.microsoft.com/office/word/2018/wordml" xmlns:w16du="http://schemas.microsoft.com/office/word/2023/wordml/word16du" xmlns:w16sdtdh="http://schemas.microsoft.com/office/word/2020/wordml/sdtdatahash" xmlns:w16sdtfl="http://schemas.microsoft.com/office/word/2024/wordml/sdtformatlock" xmlns:w16se="http://schemas.microsoft.com/office/word/2015/wordml/symex" xmlns:wpg="http://schemas.microsoft.com/office/word/2010/wordprocessingGroup" xmlns:wpi="http://schemas.microsoft.com/office/word/2010/wordprocessingInk" xmlns:wne="http://schemas.microsoft.com/office/word/2006/wordml" xmlns:wps="http://schemas.microsoft.com/office/word/2010/wordprocessingShape" mc:Ignorable="w14 w15 w16se w16cid w16 w16cex w16sdtdh w16sdtfl w16du wp14">
+<w:numbering xmlns:wpc="http://schemas.microsoft.com/office/word/2010/wordprocessingCanvas" xmlns:cx="http://schemas.microsoft.com/office/drawing/2014/chartex" xmlns:cx1="http://schemas.microsoft.com/office/drawing/2015/9/8/chartex" xmlns:cx2="http://schemas.microsoft.com/office/drawing/2015/10/21/chartex" xmlns:cx3="http://schemas.microsoft.com/office/drawing/2016/5/9/chartex" xmlns:cx4="http://schemas.microsoft.com/office/drawing/2016/5/10/chartex" xmlns:cx5="http://schemas.microsoft.com/office/drawing/2016/5/11/chartex" xmlns:cx6="http://schemas.microsoft.com/office/drawing/2016/5/12/chartex" xmlns:cx7="http://schemas.microsoft.com/office/drawing/2016/5/13/chartex" xmlns:cx8="http://schemas.microsoft.com/office/drawing/2016/5/14/chartex" xmlns:mc="http://schemas.openxmlformats.org/markup-compatibility/2006" xmlns:aink="http://schemas.microsoft.com/office/drawing/2016/ink" xmlns:am3d="http://schemas.microsoft.com/office/drawing/2017/model3d" xmlns:o="urn:schemas-microsoft-com:office:office" xmlns:oel="http://schemas.microsoft.com/office/2019/extlst" xmlns:r="http://schemas.openxmlformats.org/officeDocument/2006/relationships" xmlns:m="http://schemas.openxmlformats.org/officeDocument/2006/math" xmlns:v="urn:schemas-microsoft-com:vml" xmlns:wp14="http://schemas.microsoft.com/office/word/2010/wordprocessingDrawing" xmlns:wp="http://schemas.openxmlformats.org/drawingml/2006/wordprocessingDrawing" xmlns:w10="urn:schemas-microsoft-com:office:word" xmlns:w="http://schemas.openxmlformats.org/wordprocessingml/2006/main" xmlns:w14="http://schemas.microsoft.com/office/word/2010/wordml" xmlns:w15="http://schemas.microsoft.com/office/word/2012/wordml" xmlns:w16cei="http://schemas.microsoft.com/office/word/2026/wordml/cei" xmlns:w16cex="http://schemas.microsoft.com/office/word/2018/wordml/cex" xmlns:w16cid="http://schemas.microsoft.com/office/word/2016/wordml/cid" xmlns:w16="http://schemas.microsoft.com/office/word/2018/wordml" xmlns:w16du="http://schemas.microsoft.com/office/word/2023/wordml/word16du" xmlns:w16sdtdh="http://schemas.microsoft.com/office/word/2020/wordml/sdtdatahash" xmlns:w16sdtfl="http://schemas.microsoft.com/office/word/2024/wordml/sdtformatlock" xmlns:w16se="http://schemas.microsoft.com/office/word/2015/wordml/symex" xmlns:wpg="http://schemas.microsoft.com/office/word/2010/wordprocessingGroup" xmlns:wpi="http://schemas.microsoft.com/office/word/2010/wordprocessingInk" xmlns:wne="http://schemas.microsoft.com/office/word/2006/wordml" xmlns:wps="http://schemas.microsoft.com/office/word/2010/wordprocessingShape" mc:Ignorable="w14 w15 w16se w16cid w16 w16cex w16sdtdh w16sdtfl w16du wp14">
   <w:abstractNum w:abstractNumId="0" w15:restartNumberingAfterBreak="0">
     <w:nsid w:val="FFFFFF7C"/>
     <w:multiLevelType w:val="singleLevel"/>
@@ -1890,7 +1968,6 @@
   <w:style w:type="character" w:default="1" w:styleId="Absatz-Standardschriftart">
     <w:name w:val="Default Paragraph Font"/>
     <w:uiPriority w:val="1"/>
-    <w:semiHidden/>
     <w:unhideWhenUsed/>
   </w:style>
   <w:style w:type="table" w:default="1" w:styleId="NormaleTabelle">

</xml_diff>

<commit_message>
Vorlagen: Spaltenbreiten der Positionstabelle neu verteilt
Menge, Einheit, Einzelpreis und Gesamt waren so schmal, dass sowohl die
Ueberschriften ("Men/ge", "Einzelp/reis") als auch die Betraege ("984.00/€")
umbrachen. Die Beschreibung hatte dafuer sehr viel Platz.

Neue Breiten in Twips (Summe unveraendert 9905 = 17,5 cm):
  Pos. 700 | Beschreibung 4400 | Menge 950 | Einheit 1150
  Einzelpreis 1450 | Gesamt 1255

Betrifft Rechnung, Angebot und Gutschrift. Die Mahnungsvorlage hat bewusst
keine Positionstabelle und bleibt unveraendert.

Co-Authored-By: Claude Opus 5 <noreply@anthropic.com>
</commit_message>
<xml_diff>
--- a/vorlagen/vorlage_angebot.docx
+++ b/vorlagen/vorlage_angebot.docx
@@ -510,12 +510,12 @@
         <w:tblLook w:val="04A0" w:firstRow="1" w:lastRow="0" w:firstColumn="1" w:lastColumn="0" w:noHBand="0" w:noVBand="1"/>
       </w:tblPr>
       <w:tblGrid>
-        <w:gridCol w:w="1219"/>
-        <w:gridCol w:w="5027"/>
-        <w:gridCol w:w="745"/>
-        <w:gridCol w:w="805"/>
-        <w:gridCol w:w="1027"/>
-        <w:gridCol w:w="856"/>
+        <w:gridCol w:w="700"/>
+        <w:gridCol w:w="4400"/>
+        <w:gridCol w:w="950"/>
+        <w:gridCol w:w="1150"/>
+        <w:gridCol w:w="1450"/>
+        <w:gridCol w:w="1255"/>
       </w:tblGrid>
       <w:tr>
         <w:trPr>
@@ -523,7 +523,7 @@
         </w:trPr>
         <w:tc>
           <w:tcPr>
-            <w:tcW w:w="817" w:type="dxa"/>
+            <w:tcW w:w="700" w:type="dxa"/>
             <w:shd w:val="clear" w:color="auto" w:fill="0070C0"/>
           </w:tcPr>
           <w:p>
@@ -539,7 +539,7 @@
         </w:tc>
         <w:tc>
           <w:tcPr>
-            <w:tcW w:w="5633" w:type="dxa"/>
+            <w:tcW w:w="4400" w:type="dxa"/>
             <w:shd w:val="clear" w:color="auto" w:fill="0070C0"/>
           </w:tcPr>
           <w:p>
@@ -557,7 +557,7 @@
         </w:tc>
         <w:tc>
           <w:tcPr>
-            <w:tcW w:w="746" w:type="dxa"/>
+            <w:tcW w:w="950" w:type="dxa"/>
             <w:shd w:val="clear" w:color="auto" w:fill="0070C0"/>
           </w:tcPr>
           <w:p>
@@ -576,7 +576,7 @@
         </w:tc>
         <w:tc>
           <w:tcPr>
-            <w:tcW w:w="815" w:type="dxa"/>
+            <w:tcW w:w="1150" w:type="dxa"/>
             <w:shd w:val="clear" w:color="auto" w:fill="0070C0"/>
           </w:tcPr>
           <w:p>
@@ -595,7 +595,7 @@
         </w:tc>
         <w:tc>
           <w:tcPr>
-            <w:tcW w:w="1028" w:type="dxa"/>
+            <w:tcW w:w="1450" w:type="dxa"/>
             <w:shd w:val="clear" w:color="auto" w:fill="0070C0"/>
           </w:tcPr>
           <w:p>
@@ -616,7 +616,7 @@
         </w:tc>
         <w:tc>
           <w:tcPr>
-            <w:tcW w:w="866" w:type="dxa"/>
+            <w:tcW w:w="1255" w:type="dxa"/>
             <w:shd w:val="clear" w:color="auto" w:fill="0070C0"/>
           </w:tcPr>
           <w:p>
@@ -642,7 +642,7 @@
         </w:trPr>
         <w:tc>
           <w:tcPr>
-            <w:tcW w:w="817" w:type="dxa"/>
+            <w:tcW w:w="700" w:type="dxa"/>
           </w:tcPr>
           <w:p>
             <w:r>
@@ -669,13 +669,13 @@
         </w:tc>
         <w:tc>
           <w:tcPr>
-            <w:tcW w:w="5633" w:type="dxa"/>
+            <w:tcW w:w="4400" w:type="dxa"/>
           </w:tcPr>
           <w:p/>
         </w:tc>
         <w:tc>
           <w:tcPr>
-            <w:tcW w:w="746" w:type="dxa"/>
+            <w:tcW w:w="950" w:type="dxa"/>
           </w:tcPr>
           <w:p>
             <w:pPr>
@@ -685,7 +685,7 @@
         </w:tc>
         <w:tc>
           <w:tcPr>
-            <w:tcW w:w="815" w:type="dxa"/>
+            <w:tcW w:w="1150" w:type="dxa"/>
           </w:tcPr>
           <w:p>
             <w:pPr>
@@ -695,7 +695,7 @@
         </w:tc>
         <w:tc>
           <w:tcPr>
-            <w:tcW w:w="1028" w:type="dxa"/>
+            <w:tcW w:w="1450" w:type="dxa"/>
           </w:tcPr>
           <w:p>
             <w:pPr>
@@ -705,7 +705,7 @@
         </w:tc>
         <w:tc>
           <w:tcPr>
-            <w:tcW w:w="866" w:type="dxa"/>
+            <w:tcW w:w="1255" w:type="dxa"/>
           </w:tcPr>
           <w:p>
             <w:pPr>

</xml_diff>

<commit_message>
Vorlagen: Fusszeile durchgehend fett und zweizeilig
Bisher waren nur "Inhaber:" und "Bankverbindung:" fett, der Rest normal, und
alles stand in einer langen Zeile. Jetzt ist die komplette Fusszeile fett, und
nach der E-Mail-Adresse folgt ein Zeilenumbruch:

  Inhaber: {{inhaber}} · Hirschbergstr. 4 · 34123 Kassel · {{firma_email}}
  Bankverbindung: {{bank}} · IBAN: {{iban}} · BIC: {{bic}}

Der Absatz war ueber 25 Runs zerrissen (Word-Rechtschreibpruefung) und wurde
neu aufgebaut; Farbe (888888), Ausrichtung und Schrift bleiben unveraendert.
Nebenbei faellt ein doppeltes Leerzeichen vor "Hirschbergstr." weg.

Betrifft alle vier Vorlagen.

Co-Authored-By: Claude Opus 5 <noreply@anthropic.com>
</commit_message>
<xml_diff>
--- a/vorlagen/vorlage_angebot.docx
+++ b/vorlagen/vorlage_angebot.docx
@@ -946,147 +946,32 @@
         <w:color w:val="888888"/>
       </w:rPr>
     </w:pPr>
+    <w:proofErr w:type="spellStart"/>
+    <w:proofErr w:type="spellEnd"/>
+    <w:proofErr w:type="spellStart"/>
+    <w:proofErr w:type="gramStart"/>
+    <w:proofErr w:type="spellEnd"/>
+    <w:proofErr w:type="gramEnd"/>
+    <w:proofErr w:type="spellStart"/>
+    <w:proofErr w:type="spellEnd"/>
+    <w:proofErr w:type="spellStart"/>
+    <w:proofErr w:type="spellEnd"/>
+    <w:proofErr w:type="spellStart"/>
+    <w:proofErr w:type="spellEnd"/>
     <w:r>
       <w:rPr>
         <w:b/>
-        <w:bCs/>
         <w:color w:val="888888"/>
-        <w:lang w:val="de-DE"/>
-      </w:rPr>
-      <w:t>Inhaber:</w:t>
+      </w:rPr>
+      <w:t>Inhaber: {{inhaber}} · Hirschbergstr. 4 · 34123 Kassel · {{firma_email}}</w:t>
+      <w:br/>
     </w:r>
     <w:r>
       <w:rPr>
+        <w:b/>
         <w:color w:val="888888"/>
-        <w:lang w:val="de-DE"/>
-      </w:rPr>
-      <w:t xml:space="preserve"> </w:t>
-    </w:r>
-    <w:r>
-      <w:rPr>
-        <w:color w:val="888888"/>
-      </w:rPr>
-      <w:t>{{</w:t>
-    </w:r>
-    <w:proofErr w:type="spellStart"/>
-    <w:r>
-      <w:rPr>
-        <w:color w:val="888888"/>
-      </w:rPr>
-      <w:t>inhaber</w:t>
-    </w:r>
-    <w:proofErr w:type="spellEnd"/>
-    <w:r>
-      <w:rPr>
-        <w:color w:val="888888"/>
-      </w:rPr>
-      <w:t>}}</w:t>
-    </w:r>
-    <w:r>
-      <w:rPr>
-        <w:color w:val="888888"/>
-        <w:lang w:val="de-DE"/>
-      </w:rPr>
-      <w:t xml:space="preserve"> ·  Hirschbergstr. 4 · 34123 Kassel · </w:t>
-    </w:r>
-    <w:r>
-      <w:rPr>
-        <w:color w:val="888888"/>
-      </w:rPr>
-      <w:t>{{</w:t>
-    </w:r>
-    <w:proofErr w:type="spellStart"/>
-    <w:r>
-      <w:rPr>
-        <w:color w:val="888888"/>
-      </w:rPr>
-      <w:t>firma_</w:t>
-    </w:r>
-    <w:proofErr w:type="gramStart"/>
-    <w:r>
-      <w:rPr>
-        <w:color w:val="888888"/>
-      </w:rPr>
-      <w:t>email</w:t>
-    </w:r>
-    <w:proofErr w:type="spellEnd"/>
-    <w:proofErr w:type="gramEnd"/>
-    <w:r>
-      <w:rPr>
-        <w:color w:val="888888"/>
-      </w:rPr>
-      <w:t>}}</w:t>
-    </w:r>
-    <w:r>
-      <w:rPr>
-        <w:color w:val="888888"/>
-        <w:lang w:val="de-DE"/>
-      </w:rPr>
-      <w:t xml:space="preserve"> · </w:t>
-    </w:r>
-    <w:r>
-      <w:rPr>
-        <w:b/>
-        <w:bCs/>
-        <w:color w:val="888888"/>
-        <w:lang w:val="de-DE"/>
-      </w:rPr>
-      <w:t>Bankverbindung:</w:t>
-    </w:r>
-    <w:r>
-      <w:rPr>
-        <w:color w:val="888888"/>
-        <w:lang w:val="de-DE"/>
-      </w:rPr>
-      <w:t xml:space="preserve"> {{</w:t>
-    </w:r>
-    <w:proofErr w:type="spellStart"/>
-    <w:r>
-      <w:rPr>
-        <w:color w:val="888888"/>
-        <w:lang w:val="de-DE"/>
-      </w:rPr>
-      <w:t>bank</w:t>
-    </w:r>
-    <w:proofErr w:type="spellEnd"/>
-    <w:r>
-      <w:rPr>
-        <w:color w:val="888888"/>
-        <w:lang w:val="de-DE"/>
-      </w:rPr>
-      <w:t>}} · IBAN: {{</w:t>
-    </w:r>
-    <w:proofErr w:type="spellStart"/>
-    <w:r>
-      <w:rPr>
-        <w:color w:val="888888"/>
-        <w:lang w:val="de-DE"/>
-      </w:rPr>
-      <w:t>iban</w:t>
-    </w:r>
-    <w:proofErr w:type="spellEnd"/>
-    <w:r>
-      <w:rPr>
-        <w:color w:val="888888"/>
-        <w:lang w:val="de-DE"/>
-      </w:rPr>
-      <w:t>}} · BIC: {{</w:t>
-    </w:r>
-    <w:proofErr w:type="spellStart"/>
-    <w:r>
-      <w:rPr>
-        <w:color w:val="888888"/>
-        <w:lang w:val="de-DE"/>
-      </w:rPr>
-      <w:t>bic</w:t>
-    </w:r>
-    <w:proofErr w:type="spellEnd"/>
-    <w:r>
-      <w:rPr>
-        <w:color w:val="888888"/>
-        <w:lang w:val="de-DE"/>
-      </w:rPr>
-      <w:t>}}</w:t>
+      </w:rPr>
+      <w:t>Bankverbindung: {{bank}} · IBAN: {{iban}} · BIC: {{bic}}</w:t>
     </w:r>
   </w:p>
 </w:ftr>

</xml_diff>